<commit_message>
docs: deck layout fixes + Grant Pitch Deck V4 (three flavors)
Portfolio Deck V10 (updated in place): milestones column on the revenue
slide ran 0.6in past the right edge — capped to fit the margin. Verified
zero canvas-overflow violations via geometry audit of every element.

Grant Pitch Deck V4 (July 2026, replaces June V3 file): the dedicated
Grant-system deck alongside the portfolio deck.
- Slide 6 rebuilt: 'Two flavors' -> three-card 'Three operating modes'
  (Closed Network / Direct Compliance / Crisis-Context Fund).
- New slide 11 'Flavor 3 — Crisis-Context Fund' with the Proximate
  reference panel; footers + chapter marks renumbered (21 slides).
- Feature matrix compressed (rows/legend previously ran past the bottom
  edge of the slide); zero overflow violations after fix.

Cohesion Brief updated to reference Grant Deck V4.

Co-Authored-By: Claude Fable 5 <noreply@anthropic.com>
</commit_message>
<xml_diff>
--- a/docs/Kuja_Portfolio/00_Overall_Kuja/Kuja_Strategy_Cohesion_Brief_July2026.docx
+++ b/docs/Kuja_Portfolio/00_Overall_Kuja/Kuja_Strategy_Cohesion_Brief_July2026.docx
@@ -635,8 +635,8 @@
                 <w:sz w:val="20"/>
                 <w:szCs w:val="20"/>
               </w:rPr>
-              <w:t xml:space="preserve">Kuja Grant Pitch Deck V2 (June 2026)
-(Kuja_Grant_Pitch_Deck_June2026.pptx)</w:t>
+              <w:t xml:space="preserve">Kuja Grant Pitch Deck V4 (July 2026)
+(Kuja_Grant_Pitch_Deck_V4_July2026.pptx)</w:t>
             </w:r>
           </w:p>
         </w:tc>
@@ -670,7 +670,7 @@
                 <w:sz w:val="20"/>
                 <w:szCs w:val="20"/>
               </w:rPr>
-              <w:t xml:space="preserve">20-slide Grant-only pitch. Two flavors front and center. Feature matrix slide. Use when: pitching Grant standalone to a network secretariat, foundation, or bilateral.</w:t>
+              <w:t xml:space="preserve">21-slide Grant-only pitch. Three flavors front and center, with a dedicated Flavor 3 Crisis-Context Fund slide (Proximate, Sudan). Feature matrix slide (layout fixed to fit the slide in V4). Use when: pitching Grant standalone to a network secretariat, foundation, bilateral, or crisis-fund operator.</w:t>
             </w:r>
           </w:p>
         </w:tc>
@@ -1622,7 +1622,7 @@
           <w:sz w:val="22"/>
           <w:szCs w:val="22"/>
         </w:rPr>
-        <w:t xml:space="preserve">Grant Pitch Deck V2 → Grant Market Analysis (Sections 1-8) → Strategy V3.7 Section 4 for context.</w:t>
+        <w:t xml:space="preserve">Grant Pitch Deck V4 → Grant Market Analysis (Sections 1-8) → Strategy V3.7 Section 4 for context.</w:t>
       </w:r>
     </w:p>
     <w:p>
@@ -1682,7 +1682,7 @@
           <w:sz w:val="22"/>
           <w:szCs w:val="22"/>
         </w:rPr>
-        <w:t xml:space="preserve">Grant Pitch Deck V2 (Flavor 1 slides) → Grant Market Analysis Section 2.2 → Strategy V3.7 Section 7 (GTM motion).</w:t>
+        <w:t xml:space="preserve">Grant Pitch Deck V4 (Flavor 1 slides) → Grant Market Analysis Section 2.2 → Strategy V3.7 Section 7 (GTM motion).</w:t>
       </w:r>
     </w:p>
     <w:p>

</xml_diff>